<commit_message>
Add student information to Practical 11
</commit_message>
<xml_diff>
--- a/P11/pract-11-awdf-24CS091.docx
+++ b/P11/pract-11-awdf-24CS091.docx
@@ -1608,6 +1608,44 @@
           <w:szCs w:val="24"/>
         </w:rPr>
       </w:pPr>
+    </w:p>
+    <w:p>
+      <w:pPr>
+        <w:pStyle w:val="2"/>
+      </w:pPr>
+      <w:r>
+        <w:t>Student Information</w:t>
+      </w:r>
+    </w:p>
+    <w:p>
+      <w:r>
+        <w:t>Name: Divyata Savaj</w:t>
+      </w:r>
+    </w:p>
+    <w:p>
+      <w:r>
+        <w:t>ID: 24CS091</w:t>
+      </w:r>
+    </w:p>
+    <w:p>
+      <w:r>
+        <w:t>Email: 24cs091@charusat.edu.in</w:t>
+      </w:r>
+    </w:p>
+    <w:p>
+      <w:r>
+        <w:t>Semester: 5th Semester</w:t>
+      </w:r>
+    </w:p>
+    <w:p>
+      <w:r>
+        <w:t>Program: B.Tech</w:t>
+      </w:r>
+    </w:p>
+    <w:p>
+      <w:r>
+        <w:t>Department: CSE-CSPIT</w:t>
+      </w:r>
     </w:p>
     <w:sectPr>
       <w:headerReference r:id="rId7" w:type="first"/>

</xml_diff>

<commit_message>
Regenerate detailed Word report for Practical 11
</commit_message>
<xml_diff>
--- a/P11/pract-11-awdf-24CS091.docx
+++ b/P11/pract-11-awdf-24CS091.docx
@@ -1140,402 +1140,402 @@
               </w:rPr>
               <w:t>===============================================================</w:t>
               <w:br/>
+            </w:r>
+            <w:r>
+              <w:rPr>
+                <w:rFonts w:ascii="Consolas" w:hAnsi="Consolas"/>
+                <w:b w:val="0"/>
+                <w:sz w:val="17"/>
+              </w:rPr>
               <w:t xml:space="preserve">  Practical 11: Docker &amp; Docker Compose Containerization Verification</w:t>
               <w:br/>
+            </w:r>
+            <w:r>
+              <w:rPr>
+                <w:rFonts w:ascii="Consolas" w:hAnsi="Consolas"/>
+                <w:b w:val="0"/>
+                <w:sz w:val="17"/>
+              </w:rPr>
               <w:t xml:space="preserve">  Student: Divyata Savaj (24CS091) | Course: ITUE301</w:t>
               <w:br/>
+            </w:r>
+            <w:r>
+              <w:rPr>
+                <w:rFonts w:ascii="Consolas" w:hAnsi="Consolas"/>
+                <w:b w:val="0"/>
+                <w:sz w:val="17"/>
+              </w:rPr>
               <w:t>===============================================================</w:t>
               <w:br/>
-              <w:br/>
+            </w:r>
+            <w:r>
+              <w:rPr>
+                <w:rFonts w:ascii="Consolas" w:hAnsi="Consolas"/>
+                <w:b w:val="0"/>
+                <w:sz w:val="17"/>
+              </w:rPr>
+              <w:br/>
+            </w:r>
+            <w:r>
+              <w:rPr>
+                <w:rFonts w:ascii="Consolas" w:hAnsi="Consolas"/>
+                <w:b w:val="0"/>
+                <w:sz w:val="17"/>
+              </w:rPr>
               <w:t>[DOCKER BUILD] Building frontend image (multi-stage build)...</w:t>
               <w:br/>
+            </w:r>
+            <w:r>
+              <w:rPr>
+                <w:rFonts w:ascii="Consolas" w:hAnsi="Consolas"/>
+                <w:b w:val="0"/>
+                <w:sz w:val="17"/>
+              </w:rPr>
               <w:t xml:space="preserve">  -&gt; Stage 1: node:20-alpine build complete (vite build in 4.2s)</w:t>
               <w:br/>
+            </w:r>
+            <w:r>
+              <w:rPr>
+                <w:rFonts w:ascii="Consolas" w:hAnsi="Consolas"/>
+                <w:b w:val="0"/>
+                <w:sz w:val="17"/>
+              </w:rPr>
               <w:t xml:space="preserve">  -&gt; Stage 2: Copying dist/ to nginx:alpine /usr/share/nginx/html</w:t>
               <w:br/>
+            </w:r>
+            <w:r>
+              <w:rPr>
+                <w:rFonts w:ascii="Consolas" w:hAnsi="Consolas"/>
+                <w:b w:val="0"/>
+                <w:sz w:val="17"/>
+              </w:rPr>
               <w:t xml:space="preserve">  -&gt; Final Image Size: 37.8 MB (reduced from 842 MB, 95.5% savings)</w:t>
               <w:br/>
-              <w:br/>
+            </w:r>
+            <w:r>
+              <w:rPr>
+                <w:rFonts w:ascii="Consolas" w:hAnsi="Consolas"/>
+                <w:b w:val="0"/>
+                <w:sz w:val="17"/>
+              </w:rPr>
+              <w:br/>
+            </w:r>
+            <w:r>
+              <w:rPr>
+                <w:rFonts w:ascii="Consolas" w:hAnsi="Consolas"/>
+                <w:b w:val="0"/>
+                <w:sz w:val="17"/>
+              </w:rPr>
               <w:t>[DOCKER BUILD] Building backend image...</w:t>
               <w:br/>
+            </w:r>
+            <w:r>
+              <w:rPr>
+                <w:rFonts w:ascii="Consolas" w:hAnsi="Consolas"/>
+                <w:b w:val="0"/>
+                <w:sz w:val="17"/>
+              </w:rPr>
               <w:t xml:space="preserve">  -&gt; Base: node:20-alpine</w:t>
               <w:br/>
+            </w:r>
+            <w:r>
+              <w:rPr>
+                <w:rFonts w:ascii="Consolas" w:hAnsi="Consolas"/>
+                <w:b w:val="0"/>
+                <w:sz w:val="17"/>
+              </w:rPr>
               <w:t xml:space="preserve">  -&gt; Layer caching applied: package.json dependencies cached</w:t>
               <w:br/>
+            </w:r>
+            <w:r>
+              <w:rPr>
+                <w:rFonts w:ascii="Consolas" w:hAnsi="Consolas"/>
+                <w:b w:val="0"/>
+                <w:sz w:val="17"/>
+              </w:rPr>
               <w:t xml:space="preserve">  -&gt; Final Image Size: 142.1 MB</w:t>
               <w:br/>
-              <w:br/>
+            </w:r>
+            <w:r>
+              <w:rPr>
+                <w:rFonts w:ascii="Consolas" w:hAnsi="Consolas"/>
+                <w:b w:val="0"/>
+                <w:sz w:val="17"/>
+              </w:rPr>
+              <w:br/>
+            </w:r>
+            <w:r>
+              <w:rPr>
+                <w:rFonts w:ascii="Consolas" w:hAnsi="Consolas"/>
+                <w:b w:val="0"/>
+                <w:sz w:val="17"/>
+              </w:rPr>
               <w:t>[DOCKER COMPOSE] Starting services with: docker-compose up -d --build</w:t>
               <w:br/>
+            </w:r>
+            <w:r>
+              <w:rPr>
+                <w:rFonts w:ascii="Consolas" w:hAnsi="Consolas"/>
+                <w:b w:val="0"/>
+                <w:sz w:val="17"/>
+              </w:rPr>
               <w:t>[+] Running 4/4</w:t>
               <w:br/>
+            </w:r>
+            <w:r>
+              <w:rPr>
+                <w:rFonts w:ascii="Consolas" w:hAnsi="Consolas"/>
+                <w:b w:val="0"/>
+                <w:sz w:val="17"/>
+              </w:rPr>
               <w:t xml:space="preserve"> ✔ Network 24cs091-practical11_app-network  Created              0.1s</w:t>
               <w:br/>
+            </w:r>
+            <w:r>
+              <w:rPr>
+                <w:rFonts w:ascii="Consolas" w:hAnsi="Consolas"/>
+                <w:b w:val="0"/>
+                <w:sz w:val="17"/>
+              </w:rPr>
               <w:t xml:space="preserve"> ✔ Container 24cs091-mongodb               Started              0.8s</w:t>
               <w:br/>
+            </w:r>
+            <w:r>
+              <w:rPr>
+                <w:rFonts w:ascii="Consolas" w:hAnsi="Consolas"/>
+                <w:b w:val="0"/>
+                <w:sz w:val="17"/>
+              </w:rPr>
               <w:t xml:space="preserve"> ✔ Container 24cs091-backend               Started              1.2s</w:t>
               <w:br/>
+            </w:r>
+            <w:r>
+              <w:rPr>
+                <w:rFonts w:ascii="Consolas" w:hAnsi="Consolas"/>
+                <w:b w:val="0"/>
+                <w:sz w:val="17"/>
+              </w:rPr>
               <w:t xml:space="preserve"> ✔ Container 24cs091-frontend              Started              1.5s</w:t>
               <w:br/>
-              <w:br/>
+            </w:r>
+            <w:r>
+              <w:rPr>
+                <w:rFonts w:ascii="Consolas" w:hAnsi="Consolas"/>
+                <w:b w:val="0"/>
+                <w:sz w:val="17"/>
+              </w:rPr>
+              <w:br/>
+            </w:r>
+            <w:r>
+              <w:rPr>
+                <w:rFonts w:ascii="Consolas" w:hAnsi="Consolas"/>
+                <w:b w:val="0"/>
+                <w:sz w:val="17"/>
+              </w:rPr>
               <w:t>--- Container Health &amp; Port Verification ---</w:t>
               <w:br/>
+            </w:r>
+            <w:r>
+              <w:rPr>
+                <w:rFonts w:ascii="Consolas" w:hAnsi="Consolas"/>
+                <w:b w:val="0"/>
+                <w:sz w:val="17"/>
+              </w:rPr>
               <w:t>[PASS] mongodb  : Running on port 27017:27017 (Volume: mongo-data mounted at /data/db)</w:t>
               <w:br/>
+            </w:r>
+            <w:r>
+              <w:rPr>
+                <w:rFonts w:ascii="Consolas" w:hAnsi="Consolas"/>
+                <w:b w:val="0"/>
+                <w:sz w:val="17"/>
+              </w:rPr>
               <w:t>[PASS] backend  : Running on port 5000:5000 (Health Check: GET /health -&gt; HTTP 200 OK)</w:t>
               <w:br/>
+            </w:r>
+            <w:r>
+              <w:rPr>
+                <w:rFonts w:ascii="Consolas" w:hAnsi="Consolas"/>
+                <w:b w:val="0"/>
+                <w:sz w:val="17"/>
+              </w:rPr>
               <w:t>[PASS] frontend : Running on port 5173:80 (Nginx HTTP 200 OK)</w:t>
               <w:br/>
-              <w:br/>
+            </w:r>
+            <w:r>
+              <w:rPr>
+                <w:rFonts w:ascii="Consolas" w:hAnsi="Consolas"/>
+                <w:b w:val="0"/>
+                <w:sz w:val="17"/>
+              </w:rPr>
+              <w:br/>
+            </w:r>
+            <w:r>
+              <w:rPr>
+                <w:rFonts w:ascii="Consolas" w:hAnsi="Consolas"/>
+                <w:b w:val="0"/>
+                <w:sz w:val="17"/>
+              </w:rPr>
               <w:t>--- Inter-Container DNS Networking Verification ---</w:t>
               <w:br/>
+            </w:r>
+            <w:r>
+              <w:rPr>
+                <w:rFonts w:ascii="Consolas" w:hAnsi="Consolas"/>
+                <w:b w:val="0"/>
+                <w:sz w:val="17"/>
+              </w:rPr>
               <w:t>[PASS] Backend connected to MongoDB via container DNS: mongodb://mongodb:27017/taskdb</w:t>
               <w:br/>
+            </w:r>
+            <w:r>
+              <w:rPr>
+                <w:rFonts w:ascii="Consolas" w:hAnsi="Consolas"/>
+                <w:b w:val="0"/>
+                <w:sz w:val="17"/>
+              </w:rPr>
               <w:t>[PASS] Frontend proxy successfully routed /api/tasks to backend:5000</w:t>
               <w:br/>
-              <w:br/>
+            </w:r>
+            <w:r>
+              <w:rPr>
+                <w:rFonts w:ascii="Consolas" w:hAnsi="Consolas"/>
+                <w:b w:val="0"/>
+                <w:sz w:val="17"/>
+              </w:rPr>
+              <w:br/>
+            </w:r>
+            <w:r>
+              <w:rPr>
+                <w:rFonts w:ascii="Consolas" w:hAnsi="Consolas"/>
+                <w:b w:val="0"/>
+                <w:sz w:val="17"/>
+              </w:rPr>
               <w:t>--- Data Persistence Test (Named Volume) ---</w:t>
               <w:br/>
+            </w:r>
+            <w:r>
+              <w:rPr>
+                <w:rFonts w:ascii="Consolas" w:hAnsi="Consolas"/>
+                <w:b w:val="0"/>
+                <w:sz w:val="17"/>
+              </w:rPr>
               <w:t>[PASS] Created task "Deploy to Staging" in MongoDB container</w:t>
               <w:br/>
+            </w:r>
+            <w:r>
+              <w:rPr>
+                <w:rFonts w:ascii="Consolas" w:hAnsi="Consolas"/>
+                <w:b w:val="0"/>
+                <w:sz w:val="17"/>
+              </w:rPr>
               <w:t>[TEST] Executing: docker-compose down &amp;&amp; docker-compose up -d</w:t>
               <w:br/>
+            </w:r>
+            <w:r>
+              <w:rPr>
+                <w:rFonts w:ascii="Consolas" w:hAnsi="Consolas"/>
+                <w:b w:val="0"/>
+                <w:sz w:val="17"/>
+              </w:rPr>
               <w:t>[PASS] MongoDB container recreated with mongo-data volume reattached</w:t>
               <w:br/>
+            </w:r>
+            <w:r>
+              <w:rPr>
+                <w:rFonts w:ascii="Consolas" w:hAnsi="Consolas"/>
+                <w:b w:val="0"/>
+                <w:sz w:val="17"/>
+              </w:rPr>
               <w:t>[PASS] Task "Deploy to Staging" successfully retrieved (Persistence verified!)</w:t>
               <w:br/>
-              <w:br/>
+            </w:r>
+            <w:r>
+              <w:rPr>
+                <w:rFonts w:ascii="Consolas" w:hAnsi="Consolas"/>
+                <w:b w:val="0"/>
+                <w:sz w:val="17"/>
+              </w:rPr>
+              <w:br/>
+            </w:r>
+            <w:r>
+              <w:rPr>
+                <w:rFonts w:ascii="Consolas" w:hAnsi="Consolas"/>
+                <w:b w:val="0"/>
+                <w:sz w:val="17"/>
+              </w:rPr>
               <w:t>===============================================================</w:t>
               <w:br/>
+            </w:r>
+            <w:r>
+              <w:rPr>
+                <w:rFonts w:ascii="Consolas" w:hAnsi="Consolas"/>
+                <w:b w:val="0"/>
+                <w:sz w:val="17"/>
+              </w:rPr>
               <w:t xml:space="preserve">  Container Resource &amp; Performance Benchmark:</w:t>
               <w:br/>
+            </w:r>
+            <w:r>
+              <w:rPr>
+                <w:rFonts w:ascii="Consolas" w:hAnsi="Consolas"/>
+                <w:b w:val="0"/>
+                <w:sz w:val="17"/>
+              </w:rPr>
               <w:t>===============================================================</w:t>
               <w:br/>
+            </w:r>
+            <w:r>
+              <w:rPr>
+                <w:rFonts w:ascii="Consolas" w:hAnsi="Consolas"/>
+                <w:b w:val="0"/>
+                <w:sz w:val="17"/>
+              </w:rPr>
               <w:t>Frontend Image Size: 37.8 MB  (Multi-Stage Nginx)</w:t>
               <w:br/>
+            </w:r>
+            <w:r>
+              <w:rPr>
+                <w:rFonts w:ascii="Consolas" w:hAnsi="Consolas"/>
+                <w:b w:val="0"/>
+                <w:sz w:val="17"/>
+              </w:rPr>
               <w:t>Backend Image Size : 142.1 MB (Alpine Node 20)</w:t>
               <w:br/>
+            </w:r>
+            <w:r>
+              <w:rPr>
+                <w:rFonts w:ascii="Consolas" w:hAnsi="Consolas"/>
+                <w:b w:val="0"/>
+                <w:sz w:val="17"/>
+              </w:rPr>
               <w:t>Startup Time       : 1.5 seconds (All 3 containers healthy)</w:t>
               <w:br/>
+            </w:r>
+            <w:r>
+              <w:rPr>
+                <w:rFonts w:ascii="Consolas" w:hAnsi="Consolas"/>
+                <w:b w:val="0"/>
+                <w:sz w:val="17"/>
+              </w:rPr>
               <w:t>===============================================================</w:t>
               <w:br/>
-              <w:br/>
+            </w:r>
+            <w:r>
+              <w:rPr>
+                <w:rFonts w:ascii="Consolas" w:hAnsi="Consolas"/>
+                <w:b w:val="0"/>
+                <w:sz w:val="17"/>
+              </w:rPr>
+              <w:br/>
+            </w:r>
+            <w:r>
+              <w:rPr>
+                <w:rFonts w:ascii="Consolas" w:hAnsi="Consolas"/>
+                <w:b w:val="0"/>
+                <w:sz w:val="17"/>
+              </w:rPr>
               <w:t>Test Results Summary: All Services Healthy &amp; Operational (100%)</w:t>
-            </w:r>
-            <w:r>
-              <w:rPr>
-                <w:rFonts w:ascii="Consolas" w:hAnsi="Consolas"/>
-                <w:b w:val="0"/>
-                <w:sz w:val="17"/>
-              </w:rPr>
-            </w:r>
-            <w:r>
-              <w:rPr>
-                <w:rFonts w:ascii="Consolas" w:hAnsi="Consolas"/>
-                <w:b w:val="0"/>
-                <w:sz w:val="17"/>
-              </w:rPr>
-            </w:r>
-            <w:r>
-              <w:rPr>
-                <w:rFonts w:ascii="Consolas" w:hAnsi="Consolas"/>
-                <w:b w:val="0"/>
-                <w:sz w:val="17"/>
-              </w:rPr>
-            </w:r>
-            <w:r>
-              <w:rPr>
-                <w:rFonts w:ascii="Consolas" w:hAnsi="Consolas"/>
-                <w:b w:val="0"/>
-                <w:sz w:val="17"/>
-              </w:rPr>
-            </w:r>
-            <w:r>
-              <w:rPr>
-                <w:rFonts w:ascii="Consolas" w:hAnsi="Consolas"/>
-                <w:b w:val="0"/>
-                <w:sz w:val="17"/>
-              </w:rPr>
-            </w:r>
-            <w:r>
-              <w:rPr>
-                <w:rFonts w:ascii="Consolas" w:hAnsi="Consolas"/>
-                <w:b w:val="0"/>
-                <w:sz w:val="17"/>
-              </w:rPr>
-            </w:r>
-            <w:r>
-              <w:rPr>
-                <w:rFonts w:ascii="Consolas" w:hAnsi="Consolas"/>
-                <w:b w:val="0"/>
-                <w:sz w:val="17"/>
-              </w:rPr>
-            </w:r>
-            <w:r>
-              <w:rPr>
-                <w:rFonts w:ascii="Consolas" w:hAnsi="Consolas"/>
-                <w:b w:val="0"/>
-                <w:sz w:val="17"/>
-              </w:rPr>
-            </w:r>
-            <w:r>
-              <w:rPr>
-                <w:rFonts w:ascii="Consolas" w:hAnsi="Consolas"/>
-                <w:b w:val="0"/>
-                <w:sz w:val="17"/>
-              </w:rPr>
-            </w:r>
-            <w:r>
-              <w:rPr>
-                <w:rFonts w:ascii="Consolas" w:hAnsi="Consolas"/>
-                <w:b w:val="0"/>
-                <w:sz w:val="17"/>
-              </w:rPr>
-            </w:r>
-            <w:r>
-              <w:rPr>
-                <w:rFonts w:ascii="Consolas" w:hAnsi="Consolas"/>
-                <w:b w:val="0"/>
-                <w:sz w:val="17"/>
-              </w:rPr>
-            </w:r>
-            <w:r>
-              <w:rPr>
-                <w:rFonts w:ascii="Consolas" w:hAnsi="Consolas"/>
-                <w:b w:val="0"/>
-                <w:sz w:val="17"/>
-              </w:rPr>
-            </w:r>
-            <w:r>
-              <w:rPr>
-                <w:rFonts w:ascii="Consolas" w:hAnsi="Consolas"/>
-                <w:b w:val="0"/>
-                <w:sz w:val="17"/>
-              </w:rPr>
-            </w:r>
-            <w:r>
-              <w:rPr>
-                <w:rFonts w:ascii="Consolas" w:hAnsi="Consolas"/>
-                <w:b w:val="0"/>
-                <w:sz w:val="17"/>
-              </w:rPr>
-            </w:r>
-            <w:r>
-              <w:rPr>
-                <w:rFonts w:ascii="Consolas" w:hAnsi="Consolas"/>
-                <w:b w:val="0"/>
-                <w:sz w:val="17"/>
-              </w:rPr>
-            </w:r>
-            <w:r>
-              <w:rPr>
-                <w:rFonts w:ascii="Consolas" w:hAnsi="Consolas"/>
-                <w:b w:val="0"/>
-                <w:sz w:val="17"/>
-              </w:rPr>
-            </w:r>
-            <w:r>
-              <w:rPr>
-                <w:rFonts w:ascii="Consolas" w:hAnsi="Consolas"/>
-                <w:b w:val="0"/>
-                <w:sz w:val="17"/>
-              </w:rPr>
-            </w:r>
-            <w:r>
-              <w:rPr>
-                <w:rFonts w:ascii="Consolas" w:hAnsi="Consolas"/>
-                <w:b w:val="0"/>
-                <w:sz w:val="17"/>
-              </w:rPr>
-            </w:r>
-            <w:r>
-              <w:rPr>
-                <w:rFonts w:ascii="Consolas" w:hAnsi="Consolas"/>
-                <w:b w:val="0"/>
-                <w:sz w:val="17"/>
-              </w:rPr>
-            </w:r>
-            <w:r>
-              <w:rPr>
-                <w:rFonts w:ascii="Consolas" w:hAnsi="Consolas"/>
-                <w:b w:val="0"/>
-                <w:sz w:val="17"/>
-              </w:rPr>
-            </w:r>
-            <w:r>
-              <w:rPr>
-                <w:rFonts w:ascii="Consolas" w:hAnsi="Consolas"/>
-                <w:b w:val="0"/>
-                <w:sz w:val="17"/>
-              </w:rPr>
-            </w:r>
-            <w:r>
-              <w:rPr>
-                <w:rFonts w:ascii="Consolas" w:hAnsi="Consolas"/>
-                <w:b w:val="0"/>
-                <w:sz w:val="17"/>
-              </w:rPr>
-            </w:r>
-            <w:r>
-              <w:rPr>
-                <w:rFonts w:ascii="Consolas" w:hAnsi="Consolas"/>
-                <w:b w:val="0"/>
-                <w:sz w:val="17"/>
-              </w:rPr>
-            </w:r>
-            <w:r>
-              <w:rPr>
-                <w:rFonts w:ascii="Consolas" w:hAnsi="Consolas"/>
-                <w:b w:val="0"/>
-                <w:sz w:val="17"/>
-              </w:rPr>
-            </w:r>
-            <w:r>
-              <w:rPr>
-                <w:rFonts w:ascii="Consolas" w:hAnsi="Consolas"/>
-                <w:b w:val="0"/>
-                <w:sz w:val="17"/>
-              </w:rPr>
-            </w:r>
-            <w:r>
-              <w:rPr>
-                <w:rFonts w:ascii="Consolas" w:hAnsi="Consolas"/>
-                <w:b w:val="0"/>
-                <w:sz w:val="17"/>
-              </w:rPr>
-            </w:r>
-            <w:r>
-              <w:rPr>
-                <w:rFonts w:ascii="Consolas" w:hAnsi="Consolas"/>
-                <w:b w:val="0"/>
-                <w:sz w:val="17"/>
-              </w:rPr>
-            </w:r>
-            <w:r>
-              <w:rPr>
-                <w:rFonts w:ascii="Consolas" w:hAnsi="Consolas"/>
-                <w:b w:val="0"/>
-                <w:sz w:val="17"/>
-              </w:rPr>
-            </w:r>
-            <w:r>
-              <w:rPr>
-                <w:rFonts w:ascii="Consolas" w:hAnsi="Consolas"/>
-                <w:b w:val="0"/>
-                <w:sz w:val="17"/>
-              </w:rPr>
-            </w:r>
-            <w:r>
-              <w:rPr>
-                <w:rFonts w:ascii="Consolas" w:hAnsi="Consolas"/>
-                <w:b w:val="0"/>
-                <w:sz w:val="17"/>
-              </w:rPr>
-            </w:r>
-            <w:r>
-              <w:rPr>
-                <w:rFonts w:ascii="Consolas" w:hAnsi="Consolas"/>
-                <w:b w:val="0"/>
-                <w:sz w:val="17"/>
-              </w:rPr>
-            </w:r>
-            <w:r>
-              <w:rPr>
-                <w:rFonts w:ascii="Consolas" w:hAnsi="Consolas"/>
-                <w:b w:val="0"/>
-                <w:sz w:val="17"/>
-              </w:rPr>
-            </w:r>
-            <w:r>
-              <w:rPr>
-                <w:rFonts w:ascii="Consolas" w:hAnsi="Consolas"/>
-                <w:b w:val="0"/>
-                <w:sz w:val="17"/>
-              </w:rPr>
-            </w:r>
-            <w:r>
-              <w:rPr>
-                <w:rFonts w:ascii="Consolas" w:hAnsi="Consolas"/>
-                <w:b w:val="0"/>
-                <w:sz w:val="17"/>
-              </w:rPr>
-            </w:r>
-            <w:r>
-              <w:rPr>
-                <w:rFonts w:ascii="Consolas" w:hAnsi="Consolas"/>
-                <w:b w:val="0"/>
-                <w:sz w:val="17"/>
-              </w:rPr>
-            </w:r>
-            <w:r>
-              <w:rPr>
-                <w:rFonts w:ascii="Consolas" w:hAnsi="Consolas"/>
-                <w:b w:val="0"/>
-                <w:sz w:val="17"/>
-              </w:rPr>
-            </w:r>
-            <w:r>
-              <w:rPr>
-                <w:rFonts w:ascii="Consolas" w:hAnsi="Consolas"/>
-                <w:b w:val="0"/>
-                <w:sz w:val="17"/>
-              </w:rPr>
-            </w:r>
-            <w:r>
-              <w:rPr>
-                <w:rFonts w:ascii="Consolas" w:hAnsi="Consolas"/>
-                <w:b w:val="0"/>
-                <w:sz w:val="17"/>
-              </w:rPr>
-            </w:r>
-            <w:r>
-              <w:rPr>
-                <w:rFonts w:ascii="Consolas" w:hAnsi="Consolas"/>
-                <w:b w:val="0"/>
-                <w:sz w:val="17"/>
-              </w:rPr>
-            </w:r>
-            <w:r>
-              <w:rPr>
-                <w:rFonts w:ascii="Consolas" w:hAnsi="Consolas"/>
-                <w:b w:val="0"/>
-                <w:sz w:val="17"/>
-              </w:rPr>
-            </w:r>
-            <w:r>
-              <w:rPr>
-                <w:rFonts w:ascii="Consolas" w:hAnsi="Consolas"/>
-                <w:b w:val="0"/>
-                <w:sz w:val="17"/>
-              </w:rPr>
-            </w:r>
-            <w:r>
-              <w:rPr>
-                <w:rFonts w:ascii="Consolas" w:hAnsi="Consolas"/>
-                <w:b w:val="0"/>
-                <w:sz w:val="17"/>
-              </w:rPr>
-            </w:r>
-            <w:r>
-              <w:rPr>
-                <w:rFonts w:ascii="Consolas" w:hAnsi="Consolas"/>
-                <w:b w:val="0"/>
-                <w:sz w:val="17"/>
-              </w:rPr>
-            </w:r>
-            <w:r>
-              <w:rPr>
-                <w:rFonts w:ascii="Consolas" w:hAnsi="Consolas"/>
-                <w:b w:val="0"/>
-                <w:sz w:val="17"/>
-              </w:rPr>
-            </w:r>
-            <w:r>
-              <w:rPr>
-                <w:rFonts w:ascii="Consolas" w:hAnsi="Consolas"/>
-                <w:b w:val="0"/>
-                <w:sz w:val="17"/>
-              </w:rPr>
             </w:r>
           </w:p>
         </w:tc>
@@ -1614,7 +1614,7 @@
         <w:pStyle w:val="2"/>
       </w:pPr>
       <w:r>
-        <w:t>Student Information</w:t>
+        <w:t>Academic Details</w:t>
       </w:r>
     </w:p>
     <w:p>
@@ -1624,7 +1624,7 @@
     </w:p>
     <w:p>
       <w:r>
-        <w:t>ID: 24CS091</w:t>
+        <w:t>Student ID: 24CS091</w:t>
       </w:r>
     </w:p>
     <w:p>

</xml_diff>